<commit_message>
feat: complete User Profile module, persistent Meteor Edge Menu, post-login Sci-fi warp transition, and Remote Request master plan sync
</commit_message>
<xml_diff>
--- a/docs/Bảng_Công_việc_Voice-Assisted_Task_Board__NestJS_React_Stack_.docx
+++ b/docs/Bảng_Công_việc_Voice-Assisted_Task_Board__NestJS_React_Stack_.docx
@@ -54,6 +54,43 @@
       </w:r>
       <w:r>
         <w:t xml:space="preserve">, có phân quyền theo vai trò.</w:t>
+      </w:r>
+    </w:p>
+    <w:p>
+      <w:pPr/>
+      <w:r>
+        <w:t>1.6. Cơ chế Gửi Yêu cầu Làm việc Từ xa (Remote Work Request System)</w:t>
+      </w:r>
+    </w:p>
+    <w:p>
+      <w:r>
+        <w:rPr>
+          <w:b/>
+        </w:rPr>
+        <w:t xml:space="preserve">• Quy trình Gửi Yêu cầu Làm Remote: </w:t>
+      </w:r>
+      <w:r>
+        <w:t>Cho phép nhân viên tạo Yêu cầu làm việc từ xa (/remote-requests), chọn ngày bắt đầu - ngày kết thúc, nhập lý do và kế hoạch công việc chi tiết.</w:t>
+        <w:br/>
+      </w:r>
+      <w:r>
+        <w:rPr>
+          <w:b/>
+        </w:rPr>
+        <w:t xml:space="preserve">• Trạng thái PENDING &amp; Phê duyệt: </w:t>
+      </w:r>
+      <w:r>
+        <w:t>Khi gửi thành công, Yêu cầu tự động ở trạng thái PENDING (Chờ phản hồi). Manager hoặc Admin bấm Phê duyệt (APPROVED -&gt; Tự động cập nhật workMode = REMOTE trong CSDL Chấm công AttendanceLog) hoặc Từ chối (REJECTED -&gt; Trả về kèm lý do).</w:t>
+        <w:br/>
+      </w:r>
+      <w:r>
+        <w:rPr>
+          <w:b/>
+        </w:rPr>
+        <w:t xml:space="preserve">• CSDL RemoteRequest: </w:t>
+      </w:r>
+      <w:r>
+        <w:t>Lưu trữ các Yêu cầu làm remote (id, userId, startDate, endDate, reason, workPlan, status: PENDING/APPROVED/REJECTED, approvedById, note).</w:t>
       </w:r>
     </w:p>
     <w:p>
@@ -8219,26 +8256,7 @@
         <w:ind w:left="360" w:hanging="260"/>
       </w:pPr>
       <w:r>
-        <w:rPr>
-          <w:rFonts w:ascii="Consolas" w:cs="Consolas" w:eastAsia="Consolas" w:hAnsi="Consolas"/>
-          <w:b/>
-          <w:bCs/>
-          <w:color w:val="1E7B34"/>
-        </w:rPr>
-        <w:t xml:space="preserve">☐  </w:t>
-      </w:r>
-      <w:r>
-        <w:t xml:space="preserve">Định nghĩa enum GlobalRole, enum ProjectRole, enum Department, enum Priority, enum TaskStatus (TypeScript enum, ánh xạ sang Postgres enum qua khai báo </w:t>
-      </w:r>
-      <w:r>
-        <w:rPr>
-          <w:rFonts w:ascii="Consolas" w:cs="Consolas" w:eastAsia="Consolas" w:hAnsi="Consolas"/>
-          <w:color w:val="1E7B34"/>
-        </w:rPr>
-        <w:t xml:space="preserve">enum</w:t>
-      </w:r>
-      <w:r>
-        <w:t xml:space="preserve"> ngay trong schema.prisma).</w:t>
+        <w:t>☐  Định nghĩa enum GlobalRole, enum ProjectRole, enum Department, enum Priority, enum TaskStatus (TypeScript enum, ánh xạ sang Postgres enum qua khai báo enum ngay trong schema.prisma). [Bổ sung TaskStatus: PAUSED (tạm dừng dở dang), BLOCKED (tắc nghẽn), IN_REVIEW (chờ duyệt) và cột progress Int (0 - 100%)]</w:t>
       </w:r>
     </w:p>
     <w:p>
@@ -8427,6 +8445,182 @@
       </w:r>
       <w:r>
         <w:t xml:space="preserve">): 1 tài khoản Admin mặc định (để lần đầu deploy có thể đăng nhập và tạo các tài khoản khác), vài Project/Task mẫu để demo.</w:t>
+      </w:r>
+    </w:p>
+    <w:p>
+      <w:pPr>
+        <w:pStyle w:val="Heading1"/>
+      </w:pPr>
+      <w:r>
+        <w:t>1.2. Cơ chế Chấm công &amp; Điểm danh Thông minh (Solaris Smart Attendance System)</w:t>
+      </w:r>
+    </w:p>
+    <w:p>
+      <w:r>
+        <w:rPr>
+          <w:b/>
+        </w:rPr>
+        <w:t xml:space="preserve">• Chấm công bằng Giọng nói: </w:t>
+      </w:r>
+      <w:r>
+        <w:t>Nhân viên sử dụng câu lệnh giọng nói Tiếng Việt ("Solaris, tôi bắt đầu ca làm việc" / "Solaris, tôi kết thúc ca làm việc") để tự động ghi nhận Timestamp và điểm danh.</w:t>
+        <w:br/>
+      </w:r>
+      <w:r>
+        <w:rPr>
+          <w:b/>
+        </w:rPr>
+        <w:t xml:space="preserve">• Task-Driven Check-In: </w:t>
+      </w:r>
+      <w:r>
+        <w:t>Tự động kích hoạt Check-In ngầm ngay khi nhân viên chuyển trạng thái 1 Task từ TODO sang IN_PROGRESS đầu tiên trong ngày.</w:t>
+        <w:br/>
+      </w:r>
+      <w:r>
+        <w:rPr>
+          <w:b/>
+        </w:rPr>
+        <w:t xml:space="preserve">• Điểm danh Vùng Geofencing / IP: </w:t>
+      </w:r>
+      <w:r>
+        <w:t>Phân loại trạng thái làm việc tại văn phòng (OFFICE) hoặc làm từ xa (REMOTE).</w:t>
+        <w:br/>
+      </w:r>
+      <w:r>
+        <w:rPr>
+          <w:b/>
+        </w:rPr>
+        <w:t xml:space="preserve">• Bảng CSDL AttendanceLog: </w:t>
+      </w:r>
+      <w:r>
+        <w:t>Lưu trữ chi tiết nhật ký điểm danh (checkInAt, checkOutAt, type: VOICE/TASK_DRIVEN/MANUAL, workMode: OFFICE/REMOTE, ipAddress).</w:t>
+      </w:r>
+    </w:p>
+    <w:p>
+      <w:pPr>
+        <w:pStyle w:val="Heading1"/>
+      </w:pPr>
+      <w:r>
+        <w:t>1.3. Cơ chế Gửi Yêu cầu &amp; Chuyển giao Task Liên Nhân viên (Inter-User Task Request System)</w:t>
+      </w:r>
+    </w:p>
+    <w:p>
+      <w:r>
+        <w:rPr>
+          <w:b/>
+        </w:rPr>
+        <w:t xml:space="preserve">• Quy trình Chuyển giao &amp; Nhờ hỗ trợ Task: </w:t>
+      </w:r>
+      <w:r>
+        <w:t>Cho phép nhân viên tạo Yêu cầu Chuyển giao Task (TRANSFER), Nhờ hỗ trợ (ASSIST), hoặc Gửi kiểm thử/duyệt bài (REVIEW) cho đồng nghiệp khác.</w:t>
+        <w:br/>
+      </w:r>
+      <w:r>
+        <w:rPr>
+          <w:b/>
+        </w:rPr>
+        <w:t xml:space="preserve">• Trạng thái PENDING Tự Động: </w:t>
+      </w:r>
+      <w:r>
+        <w:t>Khi gửi Yêu cầu thành công, Yêu cầu sẽ tự động ở trạng thái PENDING (Chờ phản hồi).</w:t>
+        <w:br/>
+      </w:r>
+      <w:r>
+        <w:rPr>
+          <w:b/>
+        </w:rPr>
+        <w:t xml:space="preserve">• Phản hồi Yêu cầu: </w:t>
+      </w:r>
+      <w:r>
+        <w:t>Người nhận có thể bấm Chấp nhận (ACCEPTED -&gt; Hệ thống tự động chuyển gán người phụ trách mới) hoặc Từ chối (REJECTED -&gt; Trả Task về cho người gửi kèm lý do từ chối).</w:t>
+        <w:br/>
+      </w:r>
+      <w:r>
+        <w:rPr>
+          <w:b/>
+        </w:rPr>
+        <w:t xml:space="preserve">• Bảng CSDL TaskRequest: </w:t>
+      </w:r>
+      <w:r>
+        <w:t>Lưu trữ các Yêu cầu liên nhân viên (taskId, senderId, receiverId, type: TRANSFER/ASSIST/REVIEW, status: PENDING/ACCEPTED/REJECTED/CANCELLED, note).</w:t>
+      </w:r>
+    </w:p>
+    <w:p>
+      <w:pPr>
+        <w:pStyle w:val="Heading1"/>
+      </w:pPr>
+      <w:r>
+        <w:t>1.4. Phân biệt Độc lập giữa Phòng ban (Department) và Nghiệp vụ Chuyên môn (Profession)</w:t>
+      </w:r>
+    </w:p>
+    <w:p>
+      <w:r>
+        <w:rPr>
+          <w:b/>
+        </w:rPr>
+        <w:t xml:space="preserve">• Phòng ban (Department): </w:t>
+      </w:r>
+      <w:r>
+        <w:t>Nơi quản lý cơ cấu tổ chức (VD: Khối Product, Khối Client, Chi nhánh 1...).</w:t>
+        <w:br/>
+      </w:r>
+      <w:r>
+        <w:rPr>
+          <w:b/>
+        </w:rPr>
+        <w:t xml:space="preserve">• Nghiệp vụ Chuyên môn (Profession): </w:t>
+      </w:r>
+      <w:r>
+        <w:t>Tay nghề thực tế của nhân sự (DEV, TESTER, MARKETING, DESIGNER, BA...).</w:t>
+        <w:br/>
+      </w:r>
+      <w:r>
+        <w:rPr>
+          <w:b/>
+        </w:rPr>
+        <w:t xml:space="preserve">• Ứng dụng Quản trị: </w:t>
+      </w:r>
+      <w:r>
+        <w:t>Khi phân công công việc ở từng Giai đoạn Tiến trình, Manager lọc nhân sự theo đúng Nghiệp vụ chuyên môn để giao task chính xác tuyệt đối.</w:t>
+      </w:r>
+    </w:p>
+    <w:p>
+      <w:pPr>
+        <w:pStyle w:val="Heading1"/>
+      </w:pPr>
+      <w:r>
+        <w:t>1.5. Cơ chế Tiến trình Dự án Giai đoạn (Process Pipeline Stage)</w:t>
+      </w:r>
+    </w:p>
+    <w:p>
+      <w:r>
+        <w:rPr>
+          <w:b/>
+        </w:rPr>
+        <w:t xml:space="preserve">• Quản lý Giai đoạn Tuần tự (ProjectStage): </w:t>
+      </w:r>
+      <w:r>
+        <w:t>Chia dự án thành các Tiến trình tuần tự (Giai đoạn 1 -&gt; Giai đoạn 2 -&gt; Giai đoạn 3).</w:t>
+        <w:br/>
+      </w:r>
+      <w:r>
+        <w:rPr>
+          <w:b/>
+        </w:rPr>
+        <w:t xml:space="preserve">• Mở khóa Tiến trình (UNLOCKED): </w:t>
+      </w:r>
+      <w:r>
+        <w:t>Tiến trình trước hoàn thành (COMPLETED) mới mở khóa cho các phòng ban ở Tiến trình sau làm tiếp.</w:t>
+        <w:br/>
+      </w:r>
+      <w:r>
+        <w:rPr>
+          <w:b/>
+        </w:rPr>
+        <w:t xml:space="preserve">• Bảng CSDL ProjectStage: </w:t>
+      </w:r>
+      <w:r>
+        <w:t>Lưu trữ tiến trình dự án (id, projectId, name, orderIndex, status: LOCKED/IN_PROGRESS/COMPLETED, departmentId).</w:t>
       </w:r>
     </w:p>
     <w:p>
@@ -9866,6 +10060,91 @@
       </w:r>
       <w:r>
         <w:t xml:space="preserve">Rate limiting riêng cho POST /api/auth/login để chống brute-force mật khẩu.</w:t>
+      </w:r>
+    </w:p>
+    <w:p>
+      <w:pPr>
+        <w:pStyle w:val="Heading1"/>
+      </w:pPr>
+      <w:r>
+        <w:t>3.0.1. Thanh Menu Sao Băng Trượt Rìa Màn Hình (Meteor Shower Sliding Edge Menu)</w:t>
+      </w:r>
+    </w:p>
+    <w:p>
+      <w:r>
+        <w:rPr>
+          <w:b/>
+        </w:rPr>
+        <w:t xml:space="preserve">• Cơ chế Trượt Rìa (Edge Trigger &amp; Meteor Trail Sweep): </w:t>
+      </w:r>
+      <w:r>
+        <w:t>Thanh Menu nằm ẩn nấp dọc rìa màn hình. Khi rê chuột lại gần lề hoặc bấm phím tắt: Một chùm vệt sáng sao băng bùng nổ (@keyframes meteorSweep) trượt mở mượt mà trong 0.3s.</w:t>
+        <w:br/>
+      </w:r>
+      <w:r>
+        <w:rPr>
+          <w:b/>
+        </w:rPr>
+        <w:t xml:space="preserve">• Các Mục Menu Vệt Đuôi Sao Băng Đa Sắc: </w:t>
+      </w:r>
+      <w:r>
+        <w:t>Mỗi mục Menu bùng nổ hiệu ứng vệt đuôi sao băng khi di chuột qua: Bảng Kanban (Vàng Hổ Phách #F59E0B), Tiến trình Pipeline (Tím Nhật Thực #8B5CF6), Focus Queue (Đỏ Khẩn Cấp #EF4444), Chấm công Voice (Lục Bảo #10B981), Task Request (Bạc Ngân Hà #E2E8F0 kèm Badge PENDING).</w:t>
+        <w:br/>
+      </w:r>
+      <w:r>
+        <w:rPr>
+          <w:b/>
+        </w:rPr>
+        <w:t xml:space="preserve">• Tự Động Thu Gọn (Auto-Hide Edge Docking): </w:t>
+      </w:r>
+      <w:r>
+        <w:t>Khi chuột rời khỏi vùng Menu, thanh Menu tự động trượt thu gọn thành vệt sáng mờ dọc lề màn hình, giải phóng 100% diện tích làm việc cho Bảng Kanban.</w:t>
+      </w:r>
+    </w:p>
+    <w:p>
+      <w:pPr>
+        <w:pStyle w:val="Heading1"/>
+      </w:pPr>
+      <w:r>
+        <w:t>3.0. Hệ thống Thiết kế Giao diện UI UX Pro Max (Dark Sun Eclipse Design System)</w:t>
+      </w:r>
+    </w:p>
+    <w:p>
+      <w:r>
+        <w:t>• Bảng màu Obsidian Void (#030712), Vàng Hổ Phách (#F59E0B), Tím Nhật Thực (#8B5CF6), Lục Bảo (#10B981).</w:t>
+        <w:br/>
+      </w:r>
+      <w:r>
+        <w:t>• Vòng hào quang xoay 360 độ animate-solar-rotate, Bento Glassmorphism backdrop-filter: blur(24px) và ma trận hạt sáng 3D.</w:t>
+      </w:r>
+    </w:p>
+    <w:p>
+      <w:pPr>
+        <w:pStyle w:val="Heading1"/>
+      </w:pPr>
+      <w:r>
+        <w:t>2.14. Hàng chờ Công việc Tập trung Cá nhân (My Focus Queue &amp; URGENT Auto-Insert)</w:t>
+      </w:r>
+    </w:p>
+    <w:p>
+      <w:r>
+        <w:rPr>
+          <w:b/>
+        </w:rPr>
+        <w:t xml:space="preserve">• Quy tắc Tập trung 100%: </w:t>
+      </w:r>
+      <w:r>
+        <w:t>Mỗi nhân viên tập trung làm 1 Task duy nhất ở trạng thái IN_PROGRESS và 1 Hàng chờ Pending (TODO).</w:t>
+        <w:br/>
+      </w:r>
+      <w:r>
+        <w:rPr>
+          <w:b/>
+        </w:rPr>
+        <w:t xml:space="preserve">• Tự động chèn Task Khẩn cấp (URGENT Auto-Insert): </w:t>
+      </w:r>
+      <w:r>
+        <w:t>Khi có Task ưu tiên URGENT bắn về -&gt; Hệ thống tự động đẩy Task lên vị trí #1 của Hàng chờ Pending.</w:t>
       </w:r>
     </w:p>
     <w:p>

</xml_diff>

<commit_message>
feat: complete kanban workspace, drag rules and filters
</commit_message>
<xml_diff>
--- a/docs/Bảng_Công_việc_Voice-Assisted_Task_Board__NestJS_React_Stack_.docx
+++ b/docs/Bảng_Công_việc_Voice-Assisted_Task_Board__NestJS_React_Stack_.docx
@@ -54,6 +54,80 @@
       </w:r>
       <w:r>
         <w:t xml:space="preserve">, có phân quyền theo vai trò.</w:t>
+      </w:r>
+    </w:p>
+    <w:p>
+      <w:pPr/>
+      <w:r>
+        <w:t>1.8. Trợ Lý AI Doanh Nghiệp Bảo Mật Bảo An (Solaris Enterprise Secure AI Assistant)</w:t>
+      </w:r>
+    </w:p>
+    <w:p>
+      <w:r>
+        <w:rPr>
+          <w:b/>
+        </w:rPr>
+        <w:t xml:space="preserve">• Năng Lực Trợ Lý AI (AI Capabilities): </w:t>
+      </w:r>
+      <w:r>
+        <w:t>Hỗ trợ giải đáp thắc mắc quy trình công ty, tóm tắt tiến độ dự án, và trực tiếp thực thi các tác vụ quản trị qua giọng nói hoặc văn bản (tạo task, chuyển trạng thái, gửi duyệt bài, chấm công).</w:t>
+        <w:br/>
+      </w:r>
+      <w:r>
+        <w:rPr>
+          <w:b/>
+        </w:rPr>
+        <w:t xml:space="preserve">• Bảo Mật Dữ Liệu Doanh Nghiệp (Enterprise Data Security): </w:t>
+      </w:r>
+      <w:r>
+        <w:t>100% truy vấn AI được lọc qua tầng phân quyền RBAC (chỉ truy xuất dữ liệu mà người dùng hiện tại có quyền xem). Tự động che mờ (Data Masking) thông tin nhạy cảm trước khi gửi prompt.</w:t>
+        <w:br/>
+      </w:r>
+      <w:r>
+        <w:rPr>
+          <w:b/>
+        </w:rPr>
+        <w:t xml:space="preserve">• Cam Kết Không Huấn Luyện Dữ Liệu Công Khai (Zero Public Training): </w:t>
+      </w:r>
+      <w:r>
+        <w:t>Sử dụng API AI Enterprise với chính sách Zero Data Retention, cam kết tuyệt đối không sử dụng dữ liệu nội bộ công ty để huấn luyện các mô hình AI công khai.</w:t>
+      </w:r>
+    </w:p>
+    <w:p>
+      <w:pPr/>
+      <w:r>
+        <w:t>1.7. Cơ chế Tự Động Đăng Xuất An Toàn &amp; Quy Tắc Miễn Trừ Thông Minh (Smart Auto-Logout &amp; Exemption Rules)</w:t>
+      </w:r>
+    </w:p>
+    <w:p>
+      <w:r>
+        <w:rPr>
+          <w:b/>
+        </w:rPr>
+        <w:t xml:space="preserve">• Cơ chế Tự Động Đăng Xuất 5 Phút (5-Min Inactivity Auto-Logout): </w:t>
+      </w:r>
+      <w:r>
+        <w:t>Khi không có tương tác vật lý (chuột, bàn phím, giọng nói) trong 4 phút 30 giây -&gt; Hiển thị Pop-up Bento Kính Mờ đếm ngược 30 giây cảnh báo. Khi đủ 5 phút (300s) -&gt; Tự động xóa Token, ngắt kết nối WebSocket real-time bảo vệ dữ liệu doanh nghiệp.</w:t>
+        <w:br/>
+      </w:r>
+      <w:r>
+        <w:rPr>
+          <w:b/>
+        </w:rPr>
+        <w:t xml:space="preserve">• Miễn Trừ Khi Đang Họp WebRTC / Cuộc Gọi (/meetings / /messages): </w:t>
+      </w:r>
+      <w:r>
+        <w:t>Tạm dừng bộ đếm tự động đăng xuất khi nhân viên ở trong phòng họp WebRTC hoặc có trạng thái statusSignal = IN_MEETING (Quầng sáng Tím Nhật Thực).</w:t>
+        <w:br/>
+      </w:r>
+      <w:r>
+        <w:rPr>
+          <w:b/>
+        </w:rPr>
+        <w:t xml:space="preserve">• Miễn Trừ Khi Tab Sang Công Cụ AI (AI Tools Exemption): </w:t>
+      </w:r>
+      <w:r>
+        <w:t>Tự động nới rộng thời gian chờ lên 15 - 30 phút khi nhân viên tab sang các công cụ AI (Google Antigravity, Claude, ChatGPT/OpenAI) để nghiên cứu và cập nhật quầng sáng trạng thái 🟣 AI RESEARCH.</w:t>
       </w:r>
     </w:p>
     <w:p>
@@ -10099,6 +10173,80 @@
       </w:r>
       <w:r>
         <w:t>Khi chuột rời khỏi vùng Menu, thanh Menu tự động trượt thu gọn thành vệt sáng mờ dọc lề màn hình, giải phóng 100% diện tích làm việc cho Bảng Kanban.</w:t>
+      </w:r>
+    </w:p>
+    <w:p>
+      <w:pPr/>
+      <w:r>
+        <w:t>3.0.3. Trang Theo Dõi Chấm Công Dành Cho Admin (/admin/attendance), Nút Tạo Dự Án Mới &amp; Badge Dự Án Trên Thẻ Task</w:t>
+      </w:r>
+    </w:p>
+    <w:p>
+      <w:r>
+        <w:rPr>
+          <w:b/>
+        </w:rPr>
+        <w:t xml:space="preserve">• Trang Giám Sát Chấm Công Dành Cho Admin (/admin/attendance): </w:t>
+      </w:r>
+      <w:r>
+        <w:t>Menu hệ thống hiển thị thêm route /admin/attendance cho tài khoản Admin/Manager để theo dõi nhật ký điểm danh toàn bộ nhân sự công ty, lọc theo phòng ban, ngày/tuần/tháng và chế độ làm việc (OFFICE/REMOTE).</w:t>
+        <w:br/>
+      </w:r>
+      <w:r>
+        <w:rPr>
+          <w:b/>
+        </w:rPr>
+        <w:t xml:space="preserve">• Nút Tạo Dự Án Mới Cho Admin (+ Create Project Modal): </w:t>
+      </w:r>
+      <w:r>
+        <w:t>Tại Header Trang Bảng Task (/tasks), tài khoản Admin/Manager được bổ sung nút "+ Tạo Dự Án Mới" cho phép thiết lập tên dự án, mô tả và thành viên tham gia.</w:t>
+        <w:br/>
+      </w:r>
+      <w:r>
+        <w:rPr>
+          <w:b/>
+        </w:rPr>
+        <w:t xml:space="preserve">• Badge Tên Dự Án Trên Thẻ Task: </w:t>
+      </w:r>
+      <w:r>
+        <w:t>Mỗi thẻ Bento Task (KanbanCard) hiển thị rõ Badge Tên Dự Án (vd: 📁 Solaris Core Architecture) giúp nhận diện nguồn gốc dự án tức thì.</w:t>
+      </w:r>
+    </w:p>
+    <w:p>
+      <w:pPr/>
+      <w:r>
+        <w:t>3.0.2. Hợp Nhất Chấm Công Giọng Nói &amp; Hộp Thư Yêu Cầu Task Trực Tiếp Vào Màn Hình Bảng Task (/tasks)</w:t>
+      </w:r>
+    </w:p>
+    <w:p>
+      <w:r>
+        <w:rPr>
+          <w:b/>
+        </w:rPr>
+        <w:t xml:space="preserve">• Tích Hợp Nút Chấm Công Giọng Nói 1-Click: </w:t>
+      </w:r>
+      <w:r>
+        <w:t>Nút bấm thu âm chấm công giọng nói Tiếng Việt và đồng hồ đếm ca làm việc (04h:25m) được nhúng trực tiếp trên Thanh Header Top Bar của Trang Bảng Task (/tasks).</w:t>
+        <w:br/>
+      </w:r>
+      <w:r>
+        <w:rPr>
+          <w:b/>
+        </w:rPr>
+        <w:t xml:space="preserve">• Tích Hợp Hộp Thư Yêu Cầu Task Floating Drawer: </w:t>
+      </w:r>
+      <w:r>
+        <w:t>Hộp thư quản lý các Yêu cầu Chuyển giao (TRANSFER), Nhờ hỗ trợ (ASSIST), Gửi duyệt bài (REVIEW) được nhúng trực tiếp dưới dạng thanh Floating Drawer bên cạnh Bảng Kanban, cho phép xử lý PENDING -&gt; ACCEPTED / REJECTED trực tiếp không cần rời trang.</w:t>
+        <w:br/>
+      </w:r>
+      <w:r>
+        <w:rPr>
+          <w:b/>
+        </w:rPr>
+        <w:t xml:space="preserve">• Tối Ưu Trải Nghiệm Tác Nghiệp Tập Trung: </w:t>
+      </w:r>
+      <w:r>
+        <w:t>Giúp nhân sự tập trung 100% tại Bảng Task Workspace mà vẫn thực hiện đầy đủ các thao tác Chấm công, Chuyển giao công việc và Theo dõi tiến độ.</w:t>
       </w:r>
     </w:p>
     <w:p>

</xml_diff>